<commit_message>
progress and executable file added
</commit_message>
<xml_diff>
--- a/GenAI analysis.docx
+++ b/GenAI analysis.docx
@@ -3,23 +3,110 @@
 <w:document xmlns:wpc="http://schemas.microsoft.com/office/word/2010/wordprocessingCanvas" xmlns:cx="http://schemas.microsoft.com/office/drawing/2014/chartex" xmlns:cx1="http://schemas.microsoft.com/office/drawing/2015/9/8/chartex" xmlns:cx2="http://schemas.microsoft.com/office/drawing/2015/10/21/chartex" xmlns:cx3="http://schemas.microsoft.com/office/drawing/2016/5/9/chartex" xmlns:cx4="http://schemas.microsoft.com/office/drawing/2016/5/10/chartex" xmlns:cx5="http://schemas.microsoft.com/office/drawing/2016/5/11/chartex" xmlns:cx6="http://schemas.microsoft.com/office/drawing/2016/5/12/chartex" xmlns:cx7="http://schemas.microsoft.com/office/drawing/2016/5/13/chartex" xmlns:cx8="http://schemas.microsoft.com/office/drawing/2016/5/14/chartex" xmlns:mc="http://schemas.openxmlformats.org/markup-compatibility/2006" xmlns:aink="http://schemas.microsoft.com/office/drawing/2016/ink" xmlns:am3d="http://schemas.microsoft.com/office/drawing/2017/model3d" xmlns:o="urn:schemas-microsoft-com:office:office" xmlns:oel="http://schemas.microsoft.com/office/2019/extlst" xmlns:r="http://schemas.openxmlformats.org/officeDocument/2006/relationships" xmlns:m="http://schemas.openxmlformats.org/officeDocument/2006/math" xmlns:v="urn:schemas-microsoft-com:vml" xmlns:wp14="http://schemas.microsoft.com/office/word/2010/wordprocessingDrawing" xmlns:wp="http://schemas.openxmlformats.org/drawingml/2006/wordprocessingDrawing" xmlns:w10="urn:schemas-microsoft-com:office:word" xmlns:w="http://schemas.openxmlformats.org/wordprocessingml/2006/main" xmlns:w14="http://schemas.microsoft.com/office/word/2010/wordml" xmlns:w15="http://schemas.microsoft.com/office/word/2012/wordml" xmlns:w16cex="http://schemas.microsoft.com/office/word/2018/wordml/cex" xmlns:w16cid="http://schemas.microsoft.com/office/word/2016/wordml/cid" xmlns:w16="http://schemas.microsoft.com/office/word/2018/wordml" xmlns:w16du="http://schemas.microsoft.com/office/word/2023/wordml/word16du" xmlns:w16sdtdh="http://schemas.microsoft.com/office/word/2020/wordml/sdtdatahash" xmlns:w16sdtfl="http://schemas.microsoft.com/office/word/2024/wordml/sdtformatlock" xmlns:w16se="http://schemas.microsoft.com/office/word/2015/wordml/symex" xmlns:wpg="http://schemas.microsoft.com/office/word/2010/wordprocessingGroup" xmlns:wpi="http://schemas.microsoft.com/office/word/2010/wordprocessingInk" xmlns:wne="http://schemas.microsoft.com/office/word/2006/wordml" xmlns:wps="http://schemas.microsoft.com/office/word/2010/wordprocessingShape" mc:Ignorable="w14 w15 w16se w16cid w16 w16cex w16sdtdh w16sdtfl w16du wp14">
   <w:body>
     <w:p>
-      <w:r>
+      <w:pPr>
+        <w:rPr>
+          <w:color w:val="5B9BD5" w:themeColor="accent5"/>
+        </w:rPr>
+      </w:pPr>
+      <w:r>
+        <w:rPr>
+          <w:color w:val="5B9BD5" w:themeColor="accent5"/>
+        </w:rPr>
         <w:t>Analyze the two GenAI programs. The analysis must include:</w:t>
       </w:r>
     </w:p>
     <w:p>
-      <w:r>
-        <w:t>a. Name of two GenAI programs</w:t>
-      </w:r>
-    </w:p>
-    <w:p>
-      <w:r>
-        <w:t>b. How you accessed them (e.g., Google query, CoPilot on my computer)</w:t>
-      </w:r>
-    </w:p>
-    <w:p>
-      <w:r>
-        <w:t>c. Prompt used. (You must use the same prompt for both GenAIs.)</w:t>
+      <w:pPr>
+        <w:pStyle w:val="ListParagraph"/>
+        <w:numPr>
+          <w:ilvl w:val="0"/>
+          <w:numId w:val="1"/>
+        </w:numPr>
+        <w:rPr>
+          <w:color w:val="5B9BD5" w:themeColor="accent5"/>
+        </w:rPr>
+      </w:pPr>
+      <w:r>
+        <w:rPr>
+          <w:color w:val="5B9BD5" w:themeColor="accent5"/>
+        </w:rPr>
+        <w:t>Name of two GenAI programs</w:t>
+      </w:r>
+    </w:p>
+    <w:p>
+      <w:pPr>
+        <w:ind w:left="360"/>
+      </w:pPr>
+      <w:r>
+        <w:t xml:space="preserve">Claude and </w:t>
+      </w:r>
+      <w:r>
+        <w:t>copilot</w:t>
+      </w:r>
+    </w:p>
+    <w:p>
+      <w:pPr>
+        <w:pStyle w:val="ListParagraph"/>
+        <w:numPr>
+          <w:ilvl w:val="0"/>
+          <w:numId w:val="1"/>
+        </w:numPr>
+        <w:rPr>
+          <w:color w:val="5B9BD5" w:themeColor="accent5"/>
+        </w:rPr>
+      </w:pPr>
+      <w:r>
+        <w:rPr>
+          <w:color w:val="5B9BD5" w:themeColor="accent5"/>
+        </w:rPr>
+        <w:t>How you accessed them (e.g., Google query, CoPilot on my computer)</w:t>
+      </w:r>
+    </w:p>
+    <w:p>
+      <w:pPr>
+        <w:ind w:left="360"/>
+      </w:pPr>
+      <w:r>
+        <w:t xml:space="preserve">I accessed both of them through </w:t>
+      </w:r>
+      <w:r>
+        <w:t xml:space="preserve">Google </w:t>
+      </w:r>
+      <w:r>
+        <w:t>Crome on my laptop.</w:t>
+      </w:r>
+    </w:p>
+    <w:p>
+      <w:pPr>
+        <w:rPr>
+          <w:color w:val="5B9BD5" w:themeColor="accent5"/>
+        </w:rPr>
+      </w:pPr>
+      <w:r>
+        <w:rPr>
+          <w:color w:val="5B9BD5" w:themeColor="accent5"/>
+        </w:rPr>
+        <w:t xml:space="preserve">c. Prompt used. (You must use the same prompt for both </w:t>
+      </w:r>
+      <w:proofErr w:type="spellStart"/>
+      <w:r>
+        <w:rPr>
+          <w:color w:val="5B9BD5" w:themeColor="accent5"/>
+        </w:rPr>
+        <w:t>GenAIs</w:t>
+      </w:r>
+      <w:proofErr w:type="spellEnd"/>
+      <w:r>
+        <w:rPr>
+          <w:color w:val="5B9BD5" w:themeColor="accent5"/>
+        </w:rPr>
+        <w:t>.)</w:t>
+      </w:r>
+      <w:r>
+        <w:rPr>
+          <w:color w:val="5B9BD5" w:themeColor="accent5"/>
+        </w:rPr>
+        <w:t>:</w:t>
       </w:r>
     </w:p>
     <w:p>
@@ -32,6 +119,15 @@
       <w:r>
         <w:t>“</w:t>
       </w:r>
+      <w:r>
+        <w:t>Assignment 1 Instructions.pdf</w:t>
+      </w:r>
+      <w:r>
+        <w:t>” provided</w:t>
+      </w:r>
+      <w:r>
+        <w:t>)</w:t>
+      </w:r>
     </w:p>
     <w:p>
       <w:pPr>
@@ -40,13 +136,123 @@
       <w:r>
         <w:t>Objective</w:t>
       </w:r>
+      <w:r>
+        <w:t>:</w:t>
+      </w:r>
+    </w:p>
+    <w:p>
+      <w:pPr>
+        <w:ind w:left="1440"/>
+      </w:pPr>
+      <w:r>
+        <w:t>Write a C program that picks a secret number between 1 and 10.</w:t>
+      </w:r>
+    </w:p>
+    <w:p>
+      <w:pPr>
+        <w:ind w:left="1440"/>
+      </w:pPr>
+      <w:r>
+        <w:t>The user gets up to 3 tries to guess the number.</w:t>
+      </w:r>
     </w:p>
     <w:p>
       <w:pPr>
         <w:ind w:left="720"/>
       </w:pPr>
       <w:r>
-        <w:t>Write a C program that picks a secret number between 1 and 10.</w:t>
+        <w:t>Requirements</w:t>
+      </w:r>
+      <w:r>
+        <w:t>:</w:t>
+      </w:r>
+    </w:p>
+    <w:p>
+      <w:pPr>
+        <w:ind w:left="1440"/>
+      </w:pPr>
+      <w:r>
+        <w:t>• Use a fixed secret number (for example, 7).</w:t>
+      </w:r>
+    </w:p>
+    <w:p>
+      <w:pPr>
+        <w:ind w:left="1440"/>
+      </w:pPr>
+      <w:r>
+        <w:t xml:space="preserve">• Use </w:t>
+      </w:r>
+      <w:proofErr w:type="spellStart"/>
+      <w:r>
+        <w:t>printf</w:t>
+      </w:r>
+      <w:proofErr w:type="spellEnd"/>
+      <w:r>
+        <w:t xml:space="preserve"> to prompt the user and </w:t>
+      </w:r>
+      <w:proofErr w:type="spellStart"/>
+      <w:r>
+        <w:t>scanf</w:t>
+      </w:r>
+      <w:proofErr w:type="spellEnd"/>
+      <w:r>
+        <w:t xml:space="preserve"> to read their</w:t>
+      </w:r>
+    </w:p>
+    <w:p>
+      <w:pPr>
+        <w:ind w:left="1440"/>
+      </w:pPr>
+      <w:r>
+        <w:t>guess.</w:t>
+      </w:r>
+    </w:p>
+    <w:p>
+      <w:pPr>
+        <w:ind w:left="1440"/>
+      </w:pPr>
+      <w:r>
+        <w:t>• Use a while or for loop to let the user guess up to 3 times.</w:t>
+      </w:r>
+    </w:p>
+    <w:p>
+      <w:pPr>
+        <w:ind w:left="1440"/>
+      </w:pPr>
+      <w:r>
+        <w:t>• Use if-else statements to check if the guess is too high,</w:t>
+      </w:r>
+    </w:p>
+    <w:p>
+      <w:pPr>
+        <w:ind w:left="1440"/>
+      </w:pPr>
+      <w:r>
+        <w:t>too low, or correct.</w:t>
+      </w:r>
+    </w:p>
+    <w:p>
+      <w:pPr>
+        <w:ind w:left="1440"/>
+      </w:pPr>
+      <w:r>
+        <w:t>• Stop the loop immediately if the user guesses the correct</w:t>
+      </w:r>
+    </w:p>
+    <w:p>
+      <w:pPr>
+        <w:ind w:left="1440"/>
+      </w:pPr>
+      <w:r>
+        <w:t>number.</w:t>
+      </w:r>
+    </w:p>
+    <w:p>
+      <w:pPr>
+        <w:ind w:left="1440"/>
+      </w:pPr>
+      <w:r>
+        <w:t>• Print a final win or lose message.</w:t>
       </w:r>
     </w:p>
     <w:p>
@@ -54,202 +260,1143 @@
         <w:ind w:left="720"/>
       </w:pPr>
       <w:r>
-        <w:t>The user gets up to 3 tries to guess the number.</w:t>
-      </w:r>
-    </w:p>
-    <w:p>
-      <w:pPr>
+        <w:t>Example Output</w:t>
+      </w:r>
+      <w:r>
+        <w:t>:</w:t>
+      </w:r>
+    </w:p>
+    <w:p>
+      <w:pPr>
+        <w:ind w:left="1440"/>
+      </w:pPr>
+      <w:r>
+        <w:t>text</w:t>
+      </w:r>
+    </w:p>
+    <w:p>
+      <w:pPr>
+        <w:ind w:left="1440"/>
+      </w:pPr>
+      <w:r>
+        <w:t>Guess a number between 1 and 10.</w:t>
+      </w:r>
+    </w:p>
+    <w:p>
+      <w:pPr>
+        <w:ind w:left="1440"/>
+      </w:pPr>
+      <w:r>
+        <w:t>Attempt 1/3. Enter your guess: 5</w:t>
+      </w:r>
+    </w:p>
+    <w:p>
+      <w:pPr>
+        <w:ind w:left="1440"/>
+      </w:pPr>
+      <w:r>
+        <w:t>Too low! Try again.</w:t>
+      </w:r>
+    </w:p>
+    <w:p>
+      <w:pPr>
+        <w:ind w:left="1440"/>
+      </w:pPr>
+      <w:r>
+        <w:t>Attempt 2/3. Enter your guess: 8</w:t>
+      </w:r>
+    </w:p>
+    <w:p>
+      <w:pPr>
+        <w:ind w:left="1440"/>
+      </w:pPr>
+      <w:r>
+        <w:lastRenderedPageBreak/>
+        <w:t>Too high! Try again.</w:t>
+      </w:r>
+    </w:p>
+    <w:p>
+      <w:pPr>
+        <w:ind w:left="1440"/>
+      </w:pPr>
+      <w:r>
+        <w:t>Attempt 3/3. Enter your guess: 7</w:t>
+      </w:r>
+    </w:p>
+    <w:p>
+      <w:pPr>
+        <w:ind w:left="1440"/>
+      </w:pPr>
+      <w:r>
+        <w:t>Correct! You win!</w:t>
+      </w:r>
+    </w:p>
+    <w:p>
+      <w:pPr>
+        <w:rPr>
+          <w:color w:val="5B9BD5" w:themeColor="accent5"/>
+        </w:rPr>
+      </w:pPr>
+      <w:r>
+        <w:rPr>
+          <w:color w:val="5B9BD5" w:themeColor="accent5"/>
+        </w:rPr>
+        <w:t xml:space="preserve">d. Generated code from both </w:t>
+      </w:r>
+      <w:proofErr w:type="spellStart"/>
+      <w:r>
+        <w:rPr>
+          <w:color w:val="5B9BD5" w:themeColor="accent5"/>
+        </w:rPr>
+        <w:t>GenAIs</w:t>
+      </w:r>
+      <w:proofErr w:type="spellEnd"/>
+      <w:r>
+        <w:rPr>
+          <w:color w:val="5B9BD5" w:themeColor="accent5"/>
+        </w:rPr>
+        <w:t>.</w:t>
+      </w:r>
+    </w:p>
+    <w:p>
+      <w:r>
+        <w:tab/>
+      </w:r>
+    </w:p>
+    <w:p>
+      <w:pPr>
+        <w:spacing w:line="240" w:lineRule="auto"/>
         <w:ind w:left="720"/>
       </w:pPr>
       <w:r>
-        <w:t>Requirements</w:t>
-      </w:r>
-    </w:p>
-    <w:p>
-      <w:pPr>
+        <w:t>CLAUDE:</w:t>
+      </w:r>
+    </w:p>
+    <w:p>
+      <w:pPr>
+        <w:spacing w:line="240" w:lineRule="auto"/>
         <w:ind w:left="720"/>
       </w:pPr>
-      <w:r>
-        <w:t>• Use a fixed secret number (for example, 7).</w:t>
-      </w:r>
-    </w:p>
-    <w:p>
-      <w:pPr>
+    </w:p>
+    <w:p>
+      <w:pPr>
+        <w:spacing w:line="240" w:lineRule="auto"/>
+        <w:ind w:left="1440"/>
+      </w:pPr>
+      <w:r>
+        <w:t>#include &lt;</w:t>
+      </w:r>
+      <w:proofErr w:type="spellStart"/>
+      <w:r>
+        <w:t>stdio.h</w:t>
+      </w:r>
+      <w:proofErr w:type="spellEnd"/>
+      <w:r>
+        <w:t>&gt;</w:t>
+      </w:r>
+    </w:p>
+    <w:p>
+      <w:pPr>
+        <w:spacing w:line="240" w:lineRule="auto"/>
+        <w:ind w:left="1440"/>
+      </w:pPr>
+    </w:p>
+    <w:p>
+      <w:pPr>
+        <w:spacing w:line="240" w:lineRule="auto"/>
+        <w:ind w:left="1440"/>
+      </w:pPr>
+      <w:r>
+        <w:t>int main(void) {</w:t>
+      </w:r>
+    </w:p>
+    <w:p>
+      <w:pPr>
+        <w:spacing w:line="240" w:lineRule="auto"/>
+        <w:ind w:left="1440"/>
+      </w:pPr>
+      <w:r>
+        <w:t>    int secret = 7;</w:t>
+      </w:r>
+    </w:p>
+    <w:p>
+      <w:pPr>
+        <w:spacing w:line="240" w:lineRule="auto"/>
+        <w:ind w:left="1440"/>
+      </w:pPr>
+      <w:r>
+        <w:t>    int guess;</w:t>
+      </w:r>
+    </w:p>
+    <w:p>
+      <w:pPr>
+        <w:spacing w:line="240" w:lineRule="auto"/>
+        <w:ind w:left="1440"/>
+      </w:pPr>
+      <w:r>
+        <w:t>    int attempts = 3;</w:t>
+      </w:r>
+    </w:p>
+    <w:p>
+      <w:pPr>
+        <w:spacing w:line="240" w:lineRule="auto"/>
+        <w:ind w:left="1440"/>
+      </w:pPr>
+    </w:p>
+    <w:p>
+      <w:pPr>
+        <w:spacing w:line="240" w:lineRule="auto"/>
+        <w:ind w:left="1440"/>
+      </w:pPr>
+      <w:r>
+        <w:t xml:space="preserve">    </w:t>
+      </w:r>
+      <w:proofErr w:type="spellStart"/>
+      <w:r>
+        <w:t>printf</w:t>
+      </w:r>
+      <w:proofErr w:type="spellEnd"/>
+      <w:r>
+        <w:t>("Guess a number between 1 and 10.\n");</w:t>
+      </w:r>
+    </w:p>
+    <w:p>
+      <w:pPr>
+        <w:spacing w:line="240" w:lineRule="auto"/>
+        <w:ind w:left="1440"/>
+      </w:pPr>
+    </w:p>
+    <w:p>
+      <w:pPr>
+        <w:spacing w:line="240" w:lineRule="auto"/>
+        <w:ind w:left="1440"/>
+      </w:pPr>
+      <w:r>
+        <w:t xml:space="preserve">    for (int </w:t>
+      </w:r>
+      <w:proofErr w:type="spellStart"/>
+      <w:r>
+        <w:t>i</w:t>
+      </w:r>
+      <w:proofErr w:type="spellEnd"/>
+      <w:r>
+        <w:t xml:space="preserve"> = 1; </w:t>
+      </w:r>
+      <w:proofErr w:type="spellStart"/>
+      <w:r>
+        <w:t>i</w:t>
+      </w:r>
+      <w:proofErr w:type="spellEnd"/>
+      <w:r>
+        <w:t xml:space="preserve"> &lt;= attempts; </w:t>
+      </w:r>
+      <w:proofErr w:type="spellStart"/>
+      <w:r>
+        <w:t>i</w:t>
+      </w:r>
+      <w:proofErr w:type="spellEnd"/>
+      <w:r>
+        <w:t>++) {</w:t>
+      </w:r>
+    </w:p>
+    <w:p>
+      <w:pPr>
+        <w:spacing w:line="240" w:lineRule="auto"/>
+        <w:ind w:left="1440"/>
+      </w:pPr>
+      <w:r>
+        <w:t xml:space="preserve">        </w:t>
+      </w:r>
+      <w:proofErr w:type="spellStart"/>
+      <w:r>
+        <w:t>printf</w:t>
+      </w:r>
+      <w:proofErr w:type="spellEnd"/>
+      <w:r>
+        <w:t xml:space="preserve">("Attempt %d/%d. Enter your guess: ", </w:t>
+      </w:r>
+      <w:proofErr w:type="spellStart"/>
+      <w:r>
+        <w:t>i</w:t>
+      </w:r>
+      <w:proofErr w:type="spellEnd"/>
+      <w:r>
+        <w:t>, attempts);</w:t>
+      </w:r>
+    </w:p>
+    <w:p>
+      <w:pPr>
+        <w:spacing w:line="240" w:lineRule="auto"/>
+        <w:ind w:left="1440"/>
+      </w:pPr>
+      <w:r>
+        <w:t xml:space="preserve">        </w:t>
+      </w:r>
+      <w:proofErr w:type="spellStart"/>
+      <w:r>
+        <w:t>s</w:t>
+      </w:r>
+      <w:r>
+        <w:t>canf</w:t>
+      </w:r>
+      <w:proofErr w:type="spellEnd"/>
+      <w:r>
+        <w:t>("%d", &amp;guess);</w:t>
+      </w:r>
+    </w:p>
+    <w:p>
+      <w:pPr>
+        <w:spacing w:line="240" w:lineRule="auto"/>
+        <w:ind w:left="1440"/>
+      </w:pPr>
+    </w:p>
+    <w:p>
+      <w:pPr>
+        <w:spacing w:line="240" w:lineRule="auto"/>
+        <w:ind w:left="1440"/>
+      </w:pPr>
+      <w:r>
+        <w:t>        if (guess == secret) {</w:t>
+      </w:r>
+    </w:p>
+    <w:p>
+      <w:pPr>
+        <w:spacing w:line="240" w:lineRule="auto"/>
+        <w:ind w:left="1440"/>
+      </w:pPr>
+      <w:r>
+        <w:t xml:space="preserve">            </w:t>
+      </w:r>
+      <w:proofErr w:type="spellStart"/>
+      <w:r>
+        <w:t>printf</w:t>
+      </w:r>
+      <w:proofErr w:type="spellEnd"/>
+      <w:r>
+        <w:t>("Correct! You win!\n");</w:t>
+      </w:r>
+    </w:p>
+    <w:p>
+      <w:pPr>
+        <w:spacing w:line="240" w:lineRule="auto"/>
+        <w:ind w:left="1440"/>
+      </w:pPr>
+      <w:r>
+        <w:t>            break;</w:t>
+      </w:r>
+    </w:p>
+    <w:p>
+      <w:pPr>
+        <w:spacing w:line="240" w:lineRule="auto"/>
+        <w:ind w:left="1440"/>
+      </w:pPr>
+      <w:r>
+        <w:t>        } else if (guess &lt; secret) {</w:t>
+      </w:r>
+    </w:p>
+    <w:p>
+      <w:pPr>
+        <w:spacing w:line="240" w:lineRule="auto"/>
+        <w:ind w:left="1440"/>
+      </w:pPr>
+      <w:r>
+        <w:t xml:space="preserve">            </w:t>
+      </w:r>
+      <w:proofErr w:type="spellStart"/>
+      <w:r>
+        <w:t>printf</w:t>
+      </w:r>
+      <w:proofErr w:type="spellEnd"/>
+      <w:r>
+        <w:t>("Too low! Try again.\n");</w:t>
+      </w:r>
+    </w:p>
+    <w:p>
+      <w:pPr>
+        <w:spacing w:line="240" w:lineRule="auto"/>
+        <w:ind w:left="1440"/>
+      </w:pPr>
+      <w:r>
+        <w:t>        } else {</w:t>
+      </w:r>
+    </w:p>
+    <w:p>
+      <w:pPr>
+        <w:spacing w:line="240" w:lineRule="auto"/>
+        <w:ind w:left="1440"/>
+      </w:pPr>
+      <w:r>
+        <w:t xml:space="preserve">            </w:t>
+      </w:r>
+      <w:proofErr w:type="spellStart"/>
+      <w:r>
+        <w:t>printf</w:t>
+      </w:r>
+      <w:proofErr w:type="spellEnd"/>
+      <w:r>
+        <w:t>("Too high! Try again.\n");</w:t>
+      </w:r>
+    </w:p>
+    <w:p>
+      <w:pPr>
+        <w:spacing w:line="240" w:lineRule="auto"/>
+        <w:ind w:left="1440"/>
+      </w:pPr>
+      <w:r>
+        <w:t>        }</w:t>
+      </w:r>
+    </w:p>
+    <w:p>
+      <w:pPr>
+        <w:spacing w:line="240" w:lineRule="auto"/>
+        <w:ind w:left="1440"/>
+      </w:pPr>
+    </w:p>
+    <w:p>
+      <w:pPr>
+        <w:spacing w:line="240" w:lineRule="auto"/>
+        <w:ind w:left="1440"/>
+      </w:pPr>
+      <w:r>
+        <w:t>        if (</w:t>
+      </w:r>
+      <w:proofErr w:type="spellStart"/>
+      <w:r>
+        <w:t>i</w:t>
+      </w:r>
+      <w:proofErr w:type="spellEnd"/>
+      <w:r>
+        <w:t xml:space="preserve"> == attempts &amp;&amp; guess != secret) {</w:t>
+      </w:r>
+    </w:p>
+    <w:p>
+      <w:pPr>
+        <w:spacing w:line="240" w:lineRule="auto"/>
+        <w:ind w:left="1440"/>
+      </w:pPr>
+      <w:r>
+        <w:t xml:space="preserve">            </w:t>
+      </w:r>
+      <w:proofErr w:type="spellStart"/>
+      <w:r>
+        <w:t>printf</w:t>
+      </w:r>
+      <w:proofErr w:type="spellEnd"/>
+      <w:r>
+        <w:t>("You lose! The number was %d.\n", secret);</w:t>
+      </w:r>
+    </w:p>
+    <w:p>
+      <w:pPr>
+        <w:spacing w:line="240" w:lineRule="auto"/>
+        <w:ind w:left="1440"/>
+      </w:pPr>
+      <w:r>
+        <w:t>        }</w:t>
+      </w:r>
+    </w:p>
+    <w:p>
+      <w:pPr>
+        <w:spacing w:line="240" w:lineRule="auto"/>
+        <w:ind w:left="1440"/>
+      </w:pPr>
+      <w:r>
+        <w:t>    }</w:t>
+      </w:r>
+    </w:p>
+    <w:p>
+      <w:pPr>
+        <w:spacing w:line="240" w:lineRule="auto"/>
+        <w:ind w:left="1440"/>
+      </w:pPr>
+    </w:p>
+    <w:p>
+      <w:pPr>
+        <w:spacing w:line="240" w:lineRule="auto"/>
+        <w:ind w:left="1440"/>
+      </w:pPr>
+      <w:r>
+        <w:t>    return 0;</w:t>
+      </w:r>
+    </w:p>
+    <w:p>
+      <w:pPr>
+        <w:spacing w:line="240" w:lineRule="auto"/>
+        <w:ind w:left="1440"/>
+      </w:pPr>
+      <w:r>
+        <w:t>}</w:t>
+      </w:r>
+    </w:p>
+    <w:p>
+      <w:pPr>
+        <w:spacing w:line="240" w:lineRule="auto"/>
+        <w:ind w:left="1440"/>
+      </w:pPr>
+    </w:p>
+    <w:p>
+      <w:pPr>
+        <w:spacing w:line="240" w:lineRule="auto"/>
         <w:ind w:left="720"/>
       </w:pPr>
       <w:r>
-        <w:t>• Use printf to prompt the user and scanf to read their</w:t>
+        <w:t>COPILOT:</w:t>
+      </w:r>
+    </w:p>
+    <w:p>
+      <w:pPr>
+        <w:spacing w:line="240" w:lineRule="auto"/>
+        <w:ind w:left="1440"/>
+      </w:pPr>
+    </w:p>
+    <w:p>
+      <w:pPr>
+        <w:spacing w:line="240" w:lineRule="auto"/>
+        <w:ind w:left="1440"/>
+      </w:pPr>
+      <w:r>
+        <w:t>#include &lt;</w:t>
+      </w:r>
+      <w:proofErr w:type="spellStart"/>
+      <w:r>
+        <w:t>stdio.h</w:t>
+      </w:r>
+      <w:proofErr w:type="spellEnd"/>
+      <w:r>
+        <w:t>&gt;</w:t>
+      </w:r>
+    </w:p>
+    <w:p>
+      <w:pPr>
+        <w:spacing w:line="240" w:lineRule="auto"/>
+        <w:ind w:left="1440"/>
+      </w:pPr>
+    </w:p>
+    <w:p>
+      <w:pPr>
+        <w:spacing w:line="240" w:lineRule="auto"/>
+        <w:ind w:left="1440"/>
+      </w:pPr>
+      <w:r>
+        <w:t>int main() {</w:t>
+      </w:r>
+    </w:p>
+    <w:p>
+      <w:pPr>
+        <w:spacing w:line="240" w:lineRule="auto"/>
+        <w:ind w:left="1440"/>
+      </w:pPr>
+      <w:r>
+        <w:t>    int secret = 7;          // fixed secret number</w:t>
+      </w:r>
+    </w:p>
+    <w:p>
+      <w:pPr>
+        <w:spacing w:line="240" w:lineRule="auto"/>
+        <w:ind w:left="1440"/>
+      </w:pPr>
+      <w:r>
+        <w:t>    int guess;</w:t>
+      </w:r>
+    </w:p>
+    <w:p>
+      <w:pPr>
+        <w:spacing w:line="240" w:lineRule="auto"/>
+        <w:ind w:left="1440"/>
+      </w:pPr>
+      <w:r>
+        <w:t>    int attempts = 3;</w:t>
+      </w:r>
+    </w:p>
+    <w:p>
+      <w:pPr>
+        <w:spacing w:line="240" w:lineRule="auto"/>
+        <w:ind w:left="1440"/>
+      </w:pPr>
+    </w:p>
+    <w:p>
+      <w:pPr>
+        <w:spacing w:line="240" w:lineRule="auto"/>
+        <w:ind w:left="1440"/>
+      </w:pPr>
+      <w:r>
+        <w:t xml:space="preserve">    </w:t>
+      </w:r>
+      <w:proofErr w:type="spellStart"/>
+      <w:r>
+        <w:t>printf</w:t>
+      </w:r>
+      <w:proofErr w:type="spellEnd"/>
+      <w:r>
+        <w:t>("Guess a number between 1 and 10.\n");</w:t>
+      </w:r>
+    </w:p>
+    <w:p>
+      <w:pPr>
+        <w:spacing w:line="240" w:lineRule="auto"/>
+        <w:ind w:left="1440"/>
+      </w:pPr>
+    </w:p>
+    <w:p>
+      <w:pPr>
+        <w:spacing w:line="240" w:lineRule="auto"/>
+        <w:ind w:left="1440"/>
+      </w:pPr>
+      <w:r>
+        <w:t xml:space="preserve">    for (int </w:t>
+      </w:r>
+      <w:proofErr w:type="spellStart"/>
+      <w:r>
+        <w:t>i</w:t>
+      </w:r>
+      <w:proofErr w:type="spellEnd"/>
+      <w:r>
+        <w:t xml:space="preserve"> = 1; </w:t>
+      </w:r>
+      <w:proofErr w:type="spellStart"/>
+      <w:r>
+        <w:t>i</w:t>
+      </w:r>
+      <w:proofErr w:type="spellEnd"/>
+      <w:r>
+        <w:t xml:space="preserve"> &lt;= attempts; </w:t>
+      </w:r>
+      <w:proofErr w:type="spellStart"/>
+      <w:r>
+        <w:t>i</w:t>
+      </w:r>
+      <w:proofErr w:type="spellEnd"/>
+      <w:r>
+        <w:t>++) {</w:t>
+      </w:r>
+    </w:p>
+    <w:p>
+      <w:pPr>
+        <w:spacing w:line="240" w:lineRule="auto"/>
+        <w:ind w:left="1440"/>
+      </w:pPr>
+      <w:r>
+        <w:t xml:space="preserve">        </w:t>
+      </w:r>
+      <w:proofErr w:type="spellStart"/>
+      <w:r>
+        <w:t>printf</w:t>
+      </w:r>
+      <w:proofErr w:type="spellEnd"/>
+      <w:r>
+        <w:t xml:space="preserve">("Attempt %d/%3d. Enter your guess: ", </w:t>
+      </w:r>
+      <w:proofErr w:type="spellStart"/>
+      <w:r>
+        <w:t>i</w:t>
+      </w:r>
+      <w:proofErr w:type="spellEnd"/>
+      <w:r>
+        <w:t>, attempts);</w:t>
+      </w:r>
+    </w:p>
+    <w:p>
+      <w:pPr>
+        <w:spacing w:line="240" w:lineRule="auto"/>
+        <w:ind w:left="1440"/>
+      </w:pPr>
+      <w:r>
+        <w:t xml:space="preserve">        </w:t>
+      </w:r>
+      <w:proofErr w:type="spellStart"/>
+      <w:r>
+        <w:t>scanf</w:t>
+      </w:r>
+      <w:proofErr w:type="spellEnd"/>
+      <w:r>
+        <w:t>("%d", &amp;guess);</w:t>
+      </w:r>
+    </w:p>
+    <w:p>
+      <w:pPr>
+        <w:spacing w:line="240" w:lineRule="auto"/>
+        <w:ind w:left="1440"/>
+      </w:pPr>
+    </w:p>
+    <w:p>
+      <w:pPr>
+        <w:spacing w:line="240" w:lineRule="auto"/>
+        <w:ind w:left="1440"/>
+      </w:pPr>
+      <w:r>
+        <w:t>        if (guess == secret) {</w:t>
+      </w:r>
+    </w:p>
+    <w:p>
+      <w:pPr>
+        <w:spacing w:line="240" w:lineRule="auto"/>
+        <w:ind w:left="1440"/>
+      </w:pPr>
+      <w:r>
+        <w:t xml:space="preserve">            </w:t>
+      </w:r>
+      <w:proofErr w:type="spellStart"/>
+      <w:r>
+        <w:t>printf</w:t>
+      </w:r>
+      <w:proofErr w:type="spellEnd"/>
+      <w:r>
+        <w:t>("Correct! You win!\n");</w:t>
+      </w:r>
+    </w:p>
+    <w:p>
+      <w:pPr>
+        <w:spacing w:line="240" w:lineRule="auto"/>
+        <w:ind w:left="1440"/>
+      </w:pPr>
+      <w:r>
+        <w:t>            return 0;   // stop immediately</w:t>
+      </w:r>
+    </w:p>
+    <w:p>
+      <w:pPr>
+        <w:spacing w:line="240" w:lineRule="auto"/>
+        <w:ind w:left="1440"/>
+      </w:pPr>
+      <w:r>
+        <w:t>        } else if (guess &lt; secret) {</w:t>
+      </w:r>
+    </w:p>
+    <w:p>
+      <w:pPr>
+        <w:spacing w:line="240" w:lineRule="auto"/>
+        <w:ind w:left="1440"/>
+      </w:pPr>
+      <w:r>
+        <w:lastRenderedPageBreak/>
+        <w:t xml:space="preserve">            </w:t>
+      </w:r>
+      <w:proofErr w:type="spellStart"/>
+      <w:r>
+        <w:t>printf</w:t>
+      </w:r>
+      <w:proofErr w:type="spellEnd"/>
+      <w:r>
+        <w:t>("Too low! Try again.\n");</w:t>
+      </w:r>
+    </w:p>
+    <w:p>
+      <w:pPr>
+        <w:spacing w:line="240" w:lineRule="auto"/>
+        <w:ind w:left="1440"/>
+      </w:pPr>
+      <w:r>
+        <w:t>        } else {</w:t>
+      </w:r>
+    </w:p>
+    <w:p>
+      <w:pPr>
+        <w:spacing w:line="240" w:lineRule="auto"/>
+        <w:ind w:left="1440"/>
+      </w:pPr>
+      <w:r>
+        <w:t xml:space="preserve">            </w:t>
+      </w:r>
+      <w:proofErr w:type="spellStart"/>
+      <w:r>
+        <w:t>printf</w:t>
+      </w:r>
+      <w:proofErr w:type="spellEnd"/>
+      <w:r>
+        <w:t>("Too high! Try again.\n");</w:t>
+      </w:r>
+    </w:p>
+    <w:p>
+      <w:pPr>
+        <w:spacing w:line="240" w:lineRule="auto"/>
+        <w:ind w:left="1440"/>
+      </w:pPr>
+      <w:r>
+        <w:t>        }</w:t>
+      </w:r>
+    </w:p>
+    <w:p>
+      <w:pPr>
+        <w:spacing w:line="240" w:lineRule="auto"/>
+        <w:ind w:left="1440"/>
+      </w:pPr>
+      <w:r>
+        <w:t>    }</w:t>
+      </w:r>
+    </w:p>
+    <w:p>
+      <w:pPr>
+        <w:spacing w:line="240" w:lineRule="auto"/>
+        <w:ind w:left="1440"/>
+      </w:pPr>
+    </w:p>
+    <w:p>
+      <w:pPr>
+        <w:spacing w:line="240" w:lineRule="auto"/>
+        <w:ind w:left="1440"/>
+      </w:pPr>
+      <w:r>
+        <w:t xml:space="preserve">    </w:t>
+      </w:r>
+      <w:proofErr w:type="spellStart"/>
+      <w:r>
+        <w:t>printf</w:t>
+      </w:r>
+      <w:proofErr w:type="spellEnd"/>
+      <w:r>
+        <w:t>("Sorry, you lose. The number was %d.\n", secret);</w:t>
+      </w:r>
+    </w:p>
+    <w:p>
+      <w:pPr>
+        <w:spacing w:line="240" w:lineRule="auto"/>
+        <w:ind w:left="1440"/>
+      </w:pPr>
+      <w:r>
+        <w:t>    return 0;</w:t>
+      </w:r>
+    </w:p>
+    <w:p>
+      <w:pPr>
+        <w:spacing w:line="240" w:lineRule="auto"/>
+        <w:ind w:left="1440"/>
+      </w:pPr>
+      <w:r>
+        <w:t>}</w:t>
       </w:r>
     </w:p>
     <w:p>
       <w:pPr>
         <w:ind w:left="720"/>
-      </w:pPr>
-      <w:r>
-        <w:t>guess.</w:t>
-      </w:r>
-    </w:p>
-    <w:p>
-      <w:pPr>
-        <w:ind w:left="720"/>
-      </w:pPr>
-      <w:r>
-        <w:t>• Use a while or for loop to let the user guess up to 3 times.</w:t>
-      </w:r>
-    </w:p>
-    <w:p>
-      <w:pPr>
-        <w:ind w:left="720"/>
-      </w:pPr>
-      <w:r>
-        <w:t>• Use if-else statements to check if the guess is too high,</w:t>
-      </w:r>
-    </w:p>
-    <w:p>
-      <w:pPr>
-        <w:ind w:left="720"/>
-      </w:pPr>
-      <w:r>
-        <w:t>too low, or correct.</w:t>
-      </w:r>
-    </w:p>
-    <w:p>
-      <w:pPr>
-        <w:ind w:left="720"/>
-      </w:pPr>
-      <w:r>
-        <w:t>• Stop the loop immediately if the user guesses the correct</w:t>
-      </w:r>
-    </w:p>
-    <w:p>
-      <w:pPr>
-        <w:ind w:left="720"/>
-      </w:pPr>
-      <w:r>
-        <w:t>number.</w:t>
-      </w:r>
-    </w:p>
-    <w:p>
-      <w:pPr>
-        <w:ind w:left="720"/>
-      </w:pPr>
-      <w:r>
-        <w:t>• Print a final win or lose message.</w:t>
-      </w:r>
-    </w:p>
-    <w:p>
-      <w:pPr>
-        <w:ind w:left="720"/>
-      </w:pPr>
-      <w:r>
-        <w:t>Example Output</w:t>
-      </w:r>
-    </w:p>
-    <w:p>
-      <w:pPr>
-        <w:ind w:left="720"/>
-      </w:pPr>
-      <w:r>
-        <w:t>text</w:t>
-      </w:r>
-    </w:p>
-    <w:p>
-      <w:pPr>
-        <w:ind w:left="720"/>
-      </w:pPr>
-      <w:r>
-        <w:t>Guess a number between 1 and 10.</w:t>
-      </w:r>
-    </w:p>
-    <w:p>
-      <w:pPr>
-        <w:ind w:left="720"/>
-      </w:pPr>
-      <w:r>
-        <w:t>Attempt 1/3. Enter your guess: 5</w:t>
-      </w:r>
-    </w:p>
-    <w:p>
-      <w:pPr>
-        <w:ind w:left="720"/>
-      </w:pPr>
-      <w:r>
-        <w:t>Too low! Try again.</w:t>
-      </w:r>
-    </w:p>
-    <w:p>
-      <w:pPr>
-        <w:ind w:left="720"/>
-      </w:pPr>
-      <w:r>
-        <w:t>Attempt 2/3. Enter your guess: 8</w:t>
-      </w:r>
-    </w:p>
-    <w:p>
-      <w:pPr>
-        <w:ind w:left="720"/>
-      </w:pPr>
-      <w:r>
-        <w:t>Too high! Try again.</w:t>
-      </w:r>
-    </w:p>
-    <w:p>
-      <w:pPr>
-        <w:ind w:left="720"/>
-      </w:pPr>
-      <w:r>
-        <w:t>Attempt 3/3. Enter your guess: 7</w:t>
-      </w:r>
-    </w:p>
-    <w:p>
-      <w:pPr>
-        <w:ind w:left="720"/>
-      </w:pPr>
+        <w:rPr>
+          <w:color w:val="000000" w:themeColor="text1"/>
+        </w:rPr>
+      </w:pPr>
+    </w:p>
+    <w:p>
+      <w:pPr>
+        <w:rPr>
+          <w:color w:val="5B9BD5" w:themeColor="accent5"/>
+        </w:rPr>
+      </w:pPr>
+      <w:r>
+        <w:rPr>
+          <w:color w:val="5B9BD5" w:themeColor="accent5"/>
+        </w:rPr>
+        <w:t>e. Analyze the code in terms of correctness, execution time, space</w:t>
+      </w:r>
+    </w:p>
+    <w:p>
+      <w:pPr>
+        <w:rPr>
+          <w:color w:val="5B9BD5" w:themeColor="accent5"/>
+        </w:rPr>
+      </w:pPr>
+      <w:r>
+        <w:rPr>
+          <w:color w:val="5B9BD5" w:themeColor="accent5"/>
+        </w:rPr>
+        <w:t>complexity, and maintainability as explained in the “GenAI Code</w:t>
+      </w:r>
+    </w:p>
+    <w:p>
+      <w:pPr>
+        <w:rPr>
+          <w:color w:val="5B9BD5" w:themeColor="accent5"/>
+        </w:rPr>
+      </w:pPr>
+      <w:r>
+        <w:rPr>
+          <w:color w:val="5B9BD5" w:themeColor="accent5"/>
+        </w:rPr>
+        <w:t>Comparison” lecture.</w:t>
+      </w:r>
+    </w:p>
+    <w:p>
+      <w:pPr>
+        <w:pStyle w:val="ListParagraph"/>
+        <w:numPr>
+          <w:ilvl w:val="0"/>
+          <w:numId w:val="3"/>
+        </w:numPr>
+      </w:pPr>
+      <w:r>
+        <w:t>Correctness</w:t>
+      </w:r>
+    </w:p>
+    <w:p>
+      <w:pPr>
+        <w:ind w:left="720" w:firstLine="360"/>
+      </w:pPr>
+      <w:r>
+        <w:t xml:space="preserve">Neither code can handle when </w:t>
+      </w:r>
+      <w:r>
+        <w:t xml:space="preserve">a string is </w:t>
+      </w:r>
+      <w:r>
+        <w:t>input and b</w:t>
+      </w:r>
+      <w:r>
+        <w:t>oth allow for number below 1 and above 10</w:t>
+      </w:r>
+      <w:r>
+        <w:t xml:space="preserve">, a better implementation of this code would let the user know when the input is not viable. </w:t>
+      </w:r>
+      <w:r>
+        <w:t>Both say to try again if the user doesn’t guess the number on the last attempt</w:t>
+      </w:r>
+      <w:r>
+        <w:t>, which is also not correct.</w:t>
+      </w:r>
+    </w:p>
+    <w:p>
+      <w:r>
+        <w:tab/>
+      </w:r>
+    </w:p>
+    <w:p>
+      <w:pPr>
+        <w:pStyle w:val="ListParagraph"/>
+        <w:numPr>
+          <w:ilvl w:val="0"/>
+          <w:numId w:val="3"/>
+        </w:numPr>
+      </w:pPr>
+      <w:r>
+        <w:t>Execution time</w:t>
+      </w:r>
+    </w:p>
+    <w:p>
+      <w:pPr>
+        <w:ind w:left="720" w:firstLine="360"/>
+      </w:pPr>
+      <w:r>
+        <w:t xml:space="preserve">Claude has an unnecessary if statement to evaluate if </w:t>
+      </w:r>
+      <w:r>
+        <w:t>the number of att</w:t>
+      </w:r>
+      <w:r>
+        <w:t xml:space="preserve">empts was maxed and the </w:t>
+      </w:r>
+      <w:r>
+        <w:t xml:space="preserve">user input was not </w:t>
+      </w:r>
+      <w:r>
+        <w:t xml:space="preserve">the secret number. Copilots method of </w:t>
+      </w:r>
+      <w:r>
+        <w:t xml:space="preserve">implementing a break in the if statement for a correct guess is better for execution time because it ends the program right when it gets the correct guess </w:t>
+      </w:r>
+      <w:r>
+        <w:t>and it doesn’t need an if</w:t>
+      </w:r>
+      <w:r>
+        <w:t xml:space="preserve"> statement to determine if the secret number was ever guessed, it simply knows if it didn’t break in the </w:t>
+      </w:r>
+      <w:r>
+        <w:t>if block, it needs to print that the number was not guessed.</w:t>
+      </w:r>
+    </w:p>
+    <w:p>
+      <w:pPr>
+        <w:ind w:left="1080"/>
+      </w:pPr>
+    </w:p>
+    <w:p>
+      <w:pPr>
+        <w:pStyle w:val="ListParagraph"/>
+        <w:numPr>
+          <w:ilvl w:val="0"/>
+          <w:numId w:val="3"/>
+        </w:numPr>
+      </w:pPr>
+      <w:r>
+        <w:t>Space Complexity</w:t>
+      </w:r>
+    </w:p>
+    <w:p>
+      <w:pPr>
+        <w:ind w:left="720" w:firstLine="360"/>
+      </w:pPr>
+      <w:r>
+        <w:t xml:space="preserve">I was unable to find any space complexity differences or improvements in a static analysis of these two codes, so I entered them into Gemini </w:t>
+      </w:r>
+      <w:r>
+        <w:t xml:space="preserve">for an </w:t>
+      </w:r>
+      <w:r>
+        <w:t xml:space="preserve">LLM-as-a-Judge &amp; </w:t>
+      </w:r>
       <w:r>
         <w:lastRenderedPageBreak/>
-        <w:t>Correct! You win!</w:t>
-      </w:r>
-    </w:p>
-    <w:p>
-      <w:r>
-        <w:t>d. Generated code from both GenAIs.</w:t>
-      </w:r>
-    </w:p>
-    <w:p>
-      <w:r>
-        <w:t>e. Analyze the code in terms of correctness, execution time, space</w:t>
-      </w:r>
-    </w:p>
-    <w:p>
-      <w:r>
-        <w:t>complexity, and maintainability as explained in the “GenAI Code</w:t>
-      </w:r>
-    </w:p>
-    <w:p>
-      <w:r>
-        <w:t>Comparison” lecture.</w:t>
-      </w:r>
-    </w:p>
-    <w:p>
-      <w:r>
+        <w:t>Prompt Analysis</w:t>
+      </w:r>
+      <w:r>
+        <w:t xml:space="preserve">. Gemini </w:t>
+      </w:r>
+      <w:r>
+        <w:t>replied,</w:t>
+      </w:r>
+      <w:r>
+        <w:t xml:space="preserve"> “</w:t>
+      </w:r>
+      <w:r>
+        <w:rPr>
+          <w:b/>
+          <w:bCs/>
+        </w:rPr>
+        <w:t>Both codes have the exact same space complexity of \(O(1)\) (constant space)</w:t>
+      </w:r>
+      <w:r>
+        <w:t>, and they cannot be improved further from a memory standpoint because they already use the absolute minimum amount of memory required for this program.</w:t>
+      </w:r>
+      <w:r>
+        <w:t xml:space="preserve">” </w:t>
+      </w:r>
+    </w:p>
+    <w:p>
+      <w:pPr>
+        <w:ind w:left="720" w:firstLine="360"/>
+      </w:pPr>
+      <w:r>
+        <w:t xml:space="preserve">Neither code </w:t>
+      </w:r>
+      <w:r>
+        <w:t xml:space="preserve">uses any recursion or </w:t>
+      </w:r>
+      <w:r>
+        <w:t>data types like arrays, lists, maps, or sets</w:t>
+      </w:r>
+      <w:r>
+        <w:t>, and both use the same number of necessary variables that cannot be cut down.</w:t>
+      </w:r>
+      <w:r>
+        <w:t xml:space="preserve"> Therefore, after using every </w:t>
+      </w:r>
+    </w:p>
+    <w:p/>
+    <w:p>
+      <w:pPr>
+        <w:pStyle w:val="ListParagraph"/>
+        <w:numPr>
+          <w:ilvl w:val="0"/>
+          <w:numId w:val="3"/>
+        </w:numPr>
+      </w:pPr>
+      <w:r>
+        <w:t xml:space="preserve">Maintainability </w:t>
+      </w:r>
+    </w:p>
+    <w:p>
+      <w:pPr>
+        <w:ind w:left="720" w:firstLine="360"/>
+      </w:pPr>
+      <w:r>
+        <w:t xml:space="preserve">Copilot </w:t>
+      </w:r>
+      <w:r>
+        <w:t>had</w:t>
+      </w:r>
+      <w:r>
+        <w:t xml:space="preserve"> two comments on the code, which is more than </w:t>
+      </w:r>
+      <w:r>
+        <w:t>Claude</w:t>
+      </w:r>
+      <w:r>
+        <w:t xml:space="preserve">, but both would </w:t>
+      </w:r>
+      <w:r>
+        <w:t>have better maintainability if they had more.</w:t>
+      </w:r>
+      <w:r>
+        <w:t xml:space="preserve"> </w:t>
+      </w:r>
+      <w:r>
+        <w:t>Gemini</w:t>
+      </w:r>
+      <w:r>
+        <w:t xml:space="preserve">, the ai model, </w:t>
+      </w:r>
+      <w:r>
+        <w:t xml:space="preserve">also says that </w:t>
+      </w:r>
+      <w:r>
+        <w:t>when returning in a loop, like copilot does, it can be hard to track</w:t>
+      </w:r>
+      <w:r>
+        <w:t xml:space="preserve"> program exit points harder in larger programs.</w:t>
+      </w:r>
+    </w:p>
+    <w:p/>
+    <w:p/>
+    <w:p>
+      <w:pPr>
+        <w:rPr>
+          <w:color w:val="5B9BD5" w:themeColor="accent5"/>
+        </w:rPr>
+      </w:pPr>
+      <w:r>
+        <w:rPr>
+          <w:color w:val="5B9BD5" w:themeColor="accent5"/>
+        </w:rPr>
         <w:t>f. Select one to use as the basis for this assignment and justify why you</w:t>
       </w:r>
     </w:p>
     <w:p>
-      <w:r>
+      <w:pPr>
+        <w:rPr>
+          <w:color w:val="5B9BD5" w:themeColor="accent5"/>
+        </w:rPr>
+      </w:pPr>
+      <w:r>
+        <w:rPr>
+          <w:color w:val="5B9BD5" w:themeColor="accent5"/>
+        </w:rPr>
         <w:t>picked it.</w:t>
       </w:r>
     </w:p>
     <w:p>
       <w:r>
+        <w:tab/>
+        <w:t>I am going to use copilot</w:t>
+      </w:r>
+      <w:r>
+        <w:t xml:space="preserve"> as the basis for my code because </w:t>
+      </w:r>
+    </w:p>
+    <w:p/>
+    <w:p/>
+    <w:p>
+      <w:pPr>
+        <w:rPr>
+          <w:color w:val="5B9BD5" w:themeColor="accent5"/>
+        </w:rPr>
+      </w:pPr>
+      <w:r>
+        <w:rPr>
+          <w:color w:val="5B9BD5" w:themeColor="accent5"/>
+        </w:rPr>
         <w:t>g. Explain what you did to improve it in terms of correctness, execution time,</w:t>
       </w:r>
     </w:p>
     <w:p>
-      <w:r>
+      <w:pPr>
+        <w:rPr>
+          <w:color w:val="5B9BD5" w:themeColor="accent5"/>
+        </w:rPr>
+      </w:pPr>
+      <w:r>
+        <w:rPr>
+          <w:color w:val="5B9BD5" w:themeColor="accent5"/>
+        </w:rPr>
         <w:t>space complexity, and maintainability.</w:t>
       </w:r>
     </w:p>
+    <w:p/>
+    <w:p/>
     <w:sectPr>
       <w:pgSz w:w="12240" w:h="15840"/>
       <w:pgMar w:top="1440" w:right="1440" w:bottom="1440" w:left="1440" w:header="720" w:footer="720" w:gutter="0"/>
@@ -258,6 +1405,287 @@
     </w:sectPr>
   </w:body>
 </w:document>
+</file>
+
+<file path=word/numbering.xml><?xml version="1.0" encoding="utf-8"?>
+<w:numbering xmlns:wpc="http://schemas.microsoft.com/office/word/2010/wordprocessingCanvas" xmlns:cx="http://schemas.microsoft.com/office/drawing/2014/chartex" xmlns:cx1="http://schemas.microsoft.com/office/drawing/2015/9/8/chartex" xmlns:cx2="http://schemas.microsoft.com/office/drawing/2015/10/21/chartex" xmlns:cx3="http://schemas.microsoft.com/office/drawing/2016/5/9/chartex" xmlns:cx4="http://schemas.microsoft.com/office/drawing/2016/5/10/chartex" xmlns:cx5="http://schemas.microsoft.com/office/drawing/2016/5/11/chartex" xmlns:cx6="http://schemas.microsoft.com/office/drawing/2016/5/12/chartex" xmlns:cx7="http://schemas.microsoft.com/office/drawing/2016/5/13/chartex" xmlns:cx8="http://schemas.microsoft.com/office/drawing/2016/5/14/chartex" xmlns:mc="http://schemas.openxmlformats.org/markup-compatibility/2006" xmlns:aink="http://schemas.microsoft.com/office/drawing/2016/ink" xmlns:am3d="http://schemas.microsoft.com/office/drawing/2017/model3d" xmlns:o="urn:schemas-microsoft-com:office:office" xmlns:oel="http://schemas.microsoft.com/office/2019/extlst" xmlns:r="http://schemas.openxmlformats.org/officeDocument/2006/relationships" xmlns:m="http://schemas.openxmlformats.org/officeDocument/2006/math" xmlns:v="urn:schemas-microsoft-com:vml" xmlns:wp14="http://schemas.microsoft.com/office/word/2010/wordprocessingDrawing" xmlns:wp="http://schemas.openxmlformats.org/drawingml/2006/wordprocessingDrawing" xmlns:w10="urn:schemas-microsoft-com:office:word" xmlns:w="http://schemas.openxmlformats.org/wordprocessingml/2006/main" xmlns:w14="http://schemas.microsoft.com/office/word/2010/wordml" xmlns:w15="http://schemas.microsoft.com/office/word/2012/wordml" xmlns:w16cex="http://schemas.microsoft.com/office/word/2018/wordml/cex" xmlns:w16cid="http://schemas.microsoft.com/office/word/2016/wordml/cid" xmlns:w16="http://schemas.microsoft.com/office/word/2018/wordml" xmlns:w16du="http://schemas.microsoft.com/office/word/2023/wordml/word16du" xmlns:w16sdtdh="http://schemas.microsoft.com/office/word/2020/wordml/sdtdatahash" xmlns:w16sdtfl="http://schemas.microsoft.com/office/word/2024/wordml/sdtformatlock" xmlns:w16se="http://schemas.microsoft.com/office/word/2015/wordml/symex" xmlns:wpg="http://schemas.microsoft.com/office/word/2010/wordprocessingGroup" xmlns:wpi="http://schemas.microsoft.com/office/word/2010/wordprocessingInk" xmlns:wne="http://schemas.microsoft.com/office/word/2006/wordml" xmlns:wps="http://schemas.microsoft.com/office/word/2010/wordprocessingShape" mc:Ignorable="w14 w15 w16se w16cid w16 w16cex w16sdtdh w16sdtfl w16du wp14">
+  <w:abstractNum w:abstractNumId="0" w15:restartNumberingAfterBreak="0">
+    <w:nsid w:val="063D7C6B"/>
+    <w:multiLevelType w:val="hybridMultilevel"/>
+    <w:tmpl w:val="06B4A596"/>
+    <w:lvl w:ilvl="0" w:tplc="CFBC16FC">
+      <w:start w:val="1"/>
+      <w:numFmt w:val="decimal"/>
+      <w:lvlText w:val="%1)"/>
+      <w:lvlJc w:val="left"/>
+      <w:pPr>
+        <w:ind w:left="1080" w:hanging="360"/>
+      </w:pPr>
+      <w:rPr>
+        <w:rFonts w:hint="default"/>
+      </w:rPr>
+    </w:lvl>
+    <w:lvl w:ilvl="1" w:tplc="04090019" w:tentative="1">
+      <w:start w:val="1"/>
+      <w:numFmt w:val="lowerLetter"/>
+      <w:lvlText w:val="%2."/>
+      <w:lvlJc w:val="left"/>
+      <w:pPr>
+        <w:ind w:left="1800" w:hanging="360"/>
+      </w:pPr>
+    </w:lvl>
+    <w:lvl w:ilvl="2" w:tplc="0409001B" w:tentative="1">
+      <w:start w:val="1"/>
+      <w:numFmt w:val="lowerRoman"/>
+      <w:lvlText w:val="%3."/>
+      <w:lvlJc w:val="right"/>
+      <w:pPr>
+        <w:ind w:left="2520" w:hanging="180"/>
+      </w:pPr>
+    </w:lvl>
+    <w:lvl w:ilvl="3" w:tplc="0409000F" w:tentative="1">
+      <w:start w:val="1"/>
+      <w:numFmt w:val="decimal"/>
+      <w:lvlText w:val="%4."/>
+      <w:lvlJc w:val="left"/>
+      <w:pPr>
+        <w:ind w:left="3240" w:hanging="360"/>
+      </w:pPr>
+    </w:lvl>
+    <w:lvl w:ilvl="4" w:tplc="04090019" w:tentative="1">
+      <w:start w:val="1"/>
+      <w:numFmt w:val="lowerLetter"/>
+      <w:lvlText w:val="%5."/>
+      <w:lvlJc w:val="left"/>
+      <w:pPr>
+        <w:ind w:left="3960" w:hanging="360"/>
+      </w:pPr>
+    </w:lvl>
+    <w:lvl w:ilvl="5" w:tplc="0409001B" w:tentative="1">
+      <w:start w:val="1"/>
+      <w:numFmt w:val="lowerRoman"/>
+      <w:lvlText w:val="%6."/>
+      <w:lvlJc w:val="right"/>
+      <w:pPr>
+        <w:ind w:left="4680" w:hanging="180"/>
+      </w:pPr>
+    </w:lvl>
+    <w:lvl w:ilvl="6" w:tplc="0409000F" w:tentative="1">
+      <w:start w:val="1"/>
+      <w:numFmt w:val="decimal"/>
+      <w:lvlText w:val="%7."/>
+      <w:lvlJc w:val="left"/>
+      <w:pPr>
+        <w:ind w:left="5400" w:hanging="360"/>
+      </w:pPr>
+    </w:lvl>
+    <w:lvl w:ilvl="7" w:tplc="04090019" w:tentative="1">
+      <w:start w:val="1"/>
+      <w:numFmt w:val="lowerLetter"/>
+      <w:lvlText w:val="%8."/>
+      <w:lvlJc w:val="left"/>
+      <w:pPr>
+        <w:ind w:left="6120" w:hanging="360"/>
+      </w:pPr>
+    </w:lvl>
+    <w:lvl w:ilvl="8" w:tplc="0409001B" w:tentative="1">
+      <w:start w:val="1"/>
+      <w:numFmt w:val="lowerRoman"/>
+      <w:lvlText w:val="%9."/>
+      <w:lvlJc w:val="right"/>
+      <w:pPr>
+        <w:ind w:left="6840" w:hanging="180"/>
+      </w:pPr>
+    </w:lvl>
+  </w:abstractNum>
+  <w:abstractNum w:abstractNumId="1" w15:restartNumberingAfterBreak="0">
+    <w:nsid w:val="17E73275"/>
+    <w:multiLevelType w:val="hybridMultilevel"/>
+    <w:tmpl w:val="170ED86C"/>
+    <w:lvl w:ilvl="0" w:tplc="C0922BF0">
+      <w:start w:val="1"/>
+      <w:numFmt w:val="lowerLetter"/>
+      <w:lvlText w:val="%1)"/>
+      <w:lvlJc w:val="left"/>
+      <w:pPr>
+        <w:ind w:left="1080" w:hanging="360"/>
+      </w:pPr>
+      <w:rPr>
+        <w:rFonts w:hint="default"/>
+      </w:rPr>
+    </w:lvl>
+    <w:lvl w:ilvl="1" w:tplc="04090019" w:tentative="1">
+      <w:start w:val="1"/>
+      <w:numFmt w:val="lowerLetter"/>
+      <w:lvlText w:val="%2."/>
+      <w:lvlJc w:val="left"/>
+      <w:pPr>
+        <w:ind w:left="1800" w:hanging="360"/>
+      </w:pPr>
+    </w:lvl>
+    <w:lvl w:ilvl="2" w:tplc="0409001B" w:tentative="1">
+      <w:start w:val="1"/>
+      <w:numFmt w:val="lowerRoman"/>
+      <w:lvlText w:val="%3."/>
+      <w:lvlJc w:val="right"/>
+      <w:pPr>
+        <w:ind w:left="2520" w:hanging="180"/>
+      </w:pPr>
+    </w:lvl>
+    <w:lvl w:ilvl="3" w:tplc="0409000F" w:tentative="1">
+      <w:start w:val="1"/>
+      <w:numFmt w:val="decimal"/>
+      <w:lvlText w:val="%4."/>
+      <w:lvlJc w:val="left"/>
+      <w:pPr>
+        <w:ind w:left="3240" w:hanging="360"/>
+      </w:pPr>
+    </w:lvl>
+    <w:lvl w:ilvl="4" w:tplc="04090019" w:tentative="1">
+      <w:start w:val="1"/>
+      <w:numFmt w:val="lowerLetter"/>
+      <w:lvlText w:val="%5."/>
+      <w:lvlJc w:val="left"/>
+      <w:pPr>
+        <w:ind w:left="3960" w:hanging="360"/>
+      </w:pPr>
+    </w:lvl>
+    <w:lvl w:ilvl="5" w:tplc="0409001B" w:tentative="1">
+      <w:start w:val="1"/>
+      <w:numFmt w:val="lowerRoman"/>
+      <w:lvlText w:val="%6."/>
+      <w:lvlJc w:val="right"/>
+      <w:pPr>
+        <w:ind w:left="4680" w:hanging="180"/>
+      </w:pPr>
+    </w:lvl>
+    <w:lvl w:ilvl="6" w:tplc="0409000F" w:tentative="1">
+      <w:start w:val="1"/>
+      <w:numFmt w:val="decimal"/>
+      <w:lvlText w:val="%7."/>
+      <w:lvlJc w:val="left"/>
+      <w:pPr>
+        <w:ind w:left="5400" w:hanging="360"/>
+      </w:pPr>
+    </w:lvl>
+    <w:lvl w:ilvl="7" w:tplc="04090019" w:tentative="1">
+      <w:start w:val="1"/>
+      <w:numFmt w:val="lowerLetter"/>
+      <w:lvlText w:val="%8."/>
+      <w:lvlJc w:val="left"/>
+      <w:pPr>
+        <w:ind w:left="6120" w:hanging="360"/>
+      </w:pPr>
+    </w:lvl>
+    <w:lvl w:ilvl="8" w:tplc="0409001B" w:tentative="1">
+      <w:start w:val="1"/>
+      <w:numFmt w:val="lowerRoman"/>
+      <w:lvlText w:val="%9."/>
+      <w:lvlJc w:val="right"/>
+      <w:pPr>
+        <w:ind w:left="6840" w:hanging="180"/>
+      </w:pPr>
+    </w:lvl>
+  </w:abstractNum>
+  <w:abstractNum w:abstractNumId="2" w15:restartNumberingAfterBreak="0">
+    <w:nsid w:val="466D1624"/>
+    <w:multiLevelType w:val="hybridMultilevel"/>
+    <w:tmpl w:val="99189410"/>
+    <w:lvl w:ilvl="0" w:tplc="04090019">
+      <w:start w:val="1"/>
+      <w:numFmt w:val="lowerLetter"/>
+      <w:lvlText w:val="%1."/>
+      <w:lvlJc w:val="left"/>
+      <w:pPr>
+        <w:ind w:left="360" w:hanging="360"/>
+      </w:pPr>
+      <w:rPr>
+        <w:rFonts w:hint="default"/>
+      </w:rPr>
+    </w:lvl>
+    <w:lvl w:ilvl="1" w:tplc="04090019" w:tentative="1">
+      <w:start w:val="1"/>
+      <w:numFmt w:val="lowerLetter"/>
+      <w:lvlText w:val="%2."/>
+      <w:lvlJc w:val="left"/>
+      <w:pPr>
+        <w:ind w:left="1080" w:hanging="360"/>
+      </w:pPr>
+    </w:lvl>
+    <w:lvl w:ilvl="2" w:tplc="0409001B" w:tentative="1">
+      <w:start w:val="1"/>
+      <w:numFmt w:val="lowerRoman"/>
+      <w:lvlText w:val="%3."/>
+      <w:lvlJc w:val="right"/>
+      <w:pPr>
+        <w:ind w:left="1800" w:hanging="180"/>
+      </w:pPr>
+    </w:lvl>
+    <w:lvl w:ilvl="3" w:tplc="0409000F" w:tentative="1">
+      <w:start w:val="1"/>
+      <w:numFmt w:val="decimal"/>
+      <w:lvlText w:val="%4."/>
+      <w:lvlJc w:val="left"/>
+      <w:pPr>
+        <w:ind w:left="2520" w:hanging="360"/>
+      </w:pPr>
+    </w:lvl>
+    <w:lvl w:ilvl="4" w:tplc="04090019" w:tentative="1">
+      <w:start w:val="1"/>
+      <w:numFmt w:val="lowerLetter"/>
+      <w:lvlText w:val="%5."/>
+      <w:lvlJc w:val="left"/>
+      <w:pPr>
+        <w:ind w:left="3240" w:hanging="360"/>
+      </w:pPr>
+    </w:lvl>
+    <w:lvl w:ilvl="5" w:tplc="0409001B" w:tentative="1">
+      <w:start w:val="1"/>
+      <w:numFmt w:val="lowerRoman"/>
+      <w:lvlText w:val="%6."/>
+      <w:lvlJc w:val="right"/>
+      <w:pPr>
+        <w:ind w:left="3960" w:hanging="180"/>
+      </w:pPr>
+    </w:lvl>
+    <w:lvl w:ilvl="6" w:tplc="0409000F" w:tentative="1">
+      <w:start w:val="1"/>
+      <w:numFmt w:val="decimal"/>
+      <w:lvlText w:val="%7."/>
+      <w:lvlJc w:val="left"/>
+      <w:pPr>
+        <w:ind w:left="4680" w:hanging="360"/>
+      </w:pPr>
+    </w:lvl>
+    <w:lvl w:ilvl="7" w:tplc="04090019" w:tentative="1">
+      <w:start w:val="1"/>
+      <w:numFmt w:val="lowerLetter"/>
+      <w:lvlText w:val="%8."/>
+      <w:lvlJc w:val="left"/>
+      <w:pPr>
+        <w:ind w:left="5400" w:hanging="360"/>
+      </w:pPr>
+    </w:lvl>
+    <w:lvl w:ilvl="8" w:tplc="0409001B" w:tentative="1">
+      <w:start w:val="1"/>
+      <w:numFmt w:val="lowerRoman"/>
+      <w:lvlText w:val="%9."/>
+      <w:lvlJc w:val="right"/>
+      <w:pPr>
+        <w:ind w:left="6120" w:hanging="180"/>
+      </w:pPr>
+    </w:lvl>
+  </w:abstractNum>
+  <w:num w:numId="1" w16cid:durableId="6951074">
+    <w:abstractNumId w:val="2"/>
+  </w:num>
+  <w:num w:numId="2" w16cid:durableId="940189023">
+    <w:abstractNumId w:val="0"/>
+  </w:num>
+  <w:num w:numId="3" w16cid:durableId="1834444692">
+    <w:abstractNumId w:val="1"/>
+  </w:num>
+</w:numbering>
 </file>
 
 <file path=word/styles.xml><?xml version="1.0" encoding="utf-8"?>
@@ -688,7 +2116,6 @@
     <w:next w:val="Normal"/>
     <w:link w:val="Heading2Char"/>
     <w:uiPriority w:val="9"/>
-    <w:semiHidden/>
     <w:unhideWhenUsed/>
     <w:qFormat/>
     <w:rsid w:val="009B0BA0"/>
@@ -863,7 +2290,6 @@
   <w:style w:type="character" w:default="1" w:styleId="DefaultParagraphFont">
     <w:name w:val="Default Paragraph Font"/>
     <w:uiPriority w:val="1"/>
-    <w:semiHidden/>
     <w:unhideWhenUsed/>
   </w:style>
   <w:style w:type="table" w:default="1" w:styleId="TableNormal">
@@ -905,7 +2331,6 @@
     <w:basedOn w:val="DefaultParagraphFont"/>
     <w:link w:val="Heading2"/>
     <w:uiPriority w:val="9"/>
-    <w:semiHidden/>
     <w:rsid w:val="009B0BA0"/>
     <w:rPr>
       <w:rFonts w:asciiTheme="majorHAnsi" w:eastAsiaTheme="majorEastAsia" w:hAnsiTheme="majorHAnsi" w:cstheme="majorBidi"/>

</xml_diff>